<commit_message>
feat(misc): docs, and design fill most of the lab sheet perform other miscellaneous improvements and additions to design files
</commit_message>
<xml_diff>
--- a/Lab Sheet.docx
+++ b/Lab Sheet.docx
@@ -1,6 +1,6 @@
 
 <file path=word/document.xml><?xml version="1.0" encoding="utf-8"?>
-<w:document xmlns:wpc="http://schemas.microsoft.com/office/word/2010/wordprocessingCanvas" xmlns:cx="http://schemas.microsoft.com/office/drawing/2014/chartex" xmlns:cx1="http://schemas.microsoft.com/office/drawing/2015/9/8/chartex" xmlns:cx2="http://schemas.microsoft.com/office/drawing/2015/10/21/chartex" xmlns:cx3="http://schemas.microsoft.com/office/drawing/2016/5/9/chartex" xmlns:cx4="http://schemas.microsoft.com/office/drawing/2016/5/10/chartex" xmlns:cx5="http://schemas.microsoft.com/office/drawing/2016/5/11/chartex" xmlns:cx6="http://schemas.microsoft.com/office/drawing/2016/5/12/chartex" xmlns:cx7="http://schemas.microsoft.com/office/drawing/2016/5/13/chartex" xmlns:cx8="http://schemas.microsoft.com/office/drawing/2016/5/14/chartex" xmlns:mc="http://schemas.openxmlformats.org/markup-compatibility/2006" xmlns:aink="http://schemas.microsoft.com/office/drawing/2016/ink" xmlns:am3d="http://schemas.microsoft.com/office/drawing/2017/model3d" xmlns:o="urn:schemas-microsoft-com:office:office" xmlns:oel="http://schemas.microsoft.com/office/2019/extlst" xmlns:r="http://schemas.openxmlformats.org/officeDocument/2006/relationships" xmlns:m="http://schemas.openxmlformats.org/officeDocument/2006/math" xmlns:v="urn:schemas-microsoft-com:vml" xmlns:wp14="http://schemas.microsoft.com/office/word/2010/wordprocessingDrawing" xmlns:wp="http://schemas.openxmlformats.org/drawingml/2006/wordprocessingDrawing" xmlns:w10="urn:schemas-microsoft-com:office:word" xmlns:w="http://schemas.openxmlformats.org/wordprocessingml/2006/main" xmlns:w14="http://schemas.microsoft.com/office/word/2010/wordml" xmlns:w15="http://schemas.microsoft.com/office/word/2012/wordml" xmlns:w16cex="http://schemas.microsoft.com/office/word/2018/wordml/cex" xmlns:w16cid="http://schemas.microsoft.com/office/word/2016/wordml/cid" xmlns:w16="http://schemas.microsoft.com/office/word/2018/wordml" xmlns:w16du="http://schemas.microsoft.com/office/word/2023/wordml/word16du" xmlns:w16sdtdh="http://schemas.microsoft.com/office/word/2020/wordml/sdtdatahash" xmlns:w16se="http://schemas.microsoft.com/office/word/2015/wordml/symex" xmlns:wpg="http://schemas.microsoft.com/office/word/2010/wordprocessingGroup" xmlns:wpi="http://schemas.microsoft.com/office/word/2010/wordprocessingInk" xmlns:wne="http://schemas.microsoft.com/office/word/2006/wordml" xmlns:wps="http://schemas.microsoft.com/office/word/2010/wordprocessingShape" mc:Ignorable="w14 w15 w16se w16cid w16 w16cex w16sdtdh w16du wp14">
+<w:document xmlns:wpc="http://schemas.microsoft.com/office/word/2010/wordprocessingCanvas" xmlns:cx="http://schemas.microsoft.com/office/drawing/2014/chartex" xmlns:cx1="http://schemas.microsoft.com/office/drawing/2015/9/8/chartex" xmlns:cx2="http://schemas.microsoft.com/office/drawing/2015/10/21/chartex" xmlns:cx3="http://schemas.microsoft.com/office/drawing/2016/5/9/chartex" xmlns:cx4="http://schemas.microsoft.com/office/drawing/2016/5/10/chartex" xmlns:cx5="http://schemas.microsoft.com/office/drawing/2016/5/11/chartex" xmlns:cx6="http://schemas.microsoft.com/office/drawing/2016/5/12/chartex" xmlns:cx7="http://schemas.microsoft.com/office/drawing/2016/5/13/chartex" xmlns:cx8="http://schemas.microsoft.com/office/drawing/2016/5/14/chartex" xmlns:mc="http://schemas.openxmlformats.org/markup-compatibility/2006" xmlns:aink="http://schemas.microsoft.com/office/drawing/2016/ink" xmlns:am3d="http://schemas.microsoft.com/office/drawing/2017/model3d" xmlns:o="urn:schemas-microsoft-com:office:office" xmlns:oel="http://schemas.microsoft.com/office/2019/extlst" xmlns:r="http://schemas.openxmlformats.org/officeDocument/2006/relationships" xmlns:m="http://schemas.openxmlformats.org/officeDocument/2006/math" xmlns:v="urn:schemas-microsoft-com:vml" xmlns:wp14="http://schemas.microsoft.com/office/word/2010/wordprocessingDrawing" xmlns:wp="http://schemas.openxmlformats.org/drawingml/2006/wordprocessingDrawing" xmlns:w10="urn:schemas-microsoft-com:office:word" xmlns:w="http://schemas.openxmlformats.org/wordprocessingml/2006/main" xmlns:w14="http://schemas.microsoft.com/office/word/2010/wordml" xmlns:w15="http://schemas.microsoft.com/office/word/2012/wordml" xmlns:w16cex="http://schemas.microsoft.com/office/word/2018/wordml/cex" xmlns:w16cid="http://schemas.microsoft.com/office/word/2016/wordml/cid" xmlns:w16="http://schemas.microsoft.com/office/word/2018/wordml" xmlns:w16du="http://schemas.microsoft.com/office/word/2023/wordml/word16du" xmlns:w16sdtdh="http://schemas.microsoft.com/office/word/2020/wordml/sdtdatahash" xmlns:w16sdtfl="http://schemas.microsoft.com/office/word/2024/wordml/sdtformatlock" xmlns:w16se="http://schemas.microsoft.com/office/word/2015/wordml/symex" xmlns:wpg="http://schemas.microsoft.com/office/word/2010/wordprocessingGroup" xmlns:wpi="http://schemas.microsoft.com/office/word/2010/wordprocessingInk" xmlns:wne="http://schemas.microsoft.com/office/word/2006/wordml" xmlns:wps="http://schemas.microsoft.com/office/word/2010/wordprocessingShape" mc:Ignorable="w14 w15 w16se w16cid w16 w16cex w16sdtdh w16sdtfl w16du wp14">
   <w:body>
     <w:sdt>
       <w:sdtPr>
@@ -10,7 +10,6 @@
           <w:docPartUnique/>
         </w:docPartObj>
       </w:sdtPr>
-      <w:sdtEndPr/>
       <w:sdtContent>
         <w:p>
           <w:r>
@@ -162,7 +161,6 @@
                                         <w:dataBinding w:prefixMappings="xmlns:ns0='http://purl.org/dc/elements/1.1/' xmlns:ns1='http://schemas.openxmlformats.org/package/2006/metadata/core-properties' " w:xpath="/ns1:coreProperties[1]/ns0:title[1]" w:storeItemID="{6C3C8BC8-F283-45AE-878A-BAB7291924A1}"/>
                                         <w:text/>
                                       </w:sdtPr>
-                                      <w:sdtEndPr/>
                                       <w:sdtContent>
                                         <w:p>
                                           <w:pPr>
@@ -211,7 +209,6 @@
                                         <w:dataBinding w:prefixMappings="xmlns:ns0='http://purl.org/dc/elements/1.1/' xmlns:ns1='http://schemas.openxmlformats.org/package/2006/metadata/core-properties' " w:xpath="/ns1:coreProperties[1]/ns0:subject[1]" w:storeItemID="{6C3C8BC8-F283-45AE-878A-BAB7291924A1}"/>
                                         <w:text/>
                                       </w:sdtPr>
-                                      <w:sdtEndPr/>
                                       <w:sdtContent>
                                         <w:p>
                                           <w:pPr>
@@ -415,7 +412,6 @@
                                   <w:dataBinding w:prefixMappings="xmlns:ns0='http://purl.org/dc/elements/1.1/' xmlns:ns1='http://schemas.openxmlformats.org/package/2006/metadata/core-properties' " w:xpath="/ns1:coreProperties[1]/ns0:title[1]" w:storeItemID="{6C3C8BC8-F283-45AE-878A-BAB7291924A1}"/>
                                   <w:text/>
                                 </w:sdtPr>
-                                <w:sdtEndPr/>
                                 <w:sdtContent>
                                   <w:p>
                                     <w:pPr>
@@ -464,7 +460,6 @@
                                   <w:dataBinding w:prefixMappings="xmlns:ns0='http://purl.org/dc/elements/1.1/' xmlns:ns1='http://schemas.openxmlformats.org/package/2006/metadata/core-properties' " w:xpath="/ns1:coreProperties[1]/ns0:subject[1]" w:storeItemID="{6C3C8BC8-F283-45AE-878A-BAB7291924A1}"/>
                                   <w:text/>
                                 </w:sdtPr>
-                                <w:sdtEndPr/>
                                 <w:sdtContent>
                                   <w:p>
                                     <w:pPr>
@@ -1383,7 +1378,15 @@
           <w:sz w:val="24"/>
           <w:szCs w:val="24"/>
         </w:rPr>
-        <w:t>24x34</w:t>
+        <w:t>24x3</w:t>
+      </w:r>
+      <w:r>
+        <w:rPr>
+          <w:rFonts w:eastAsiaTheme="minorHAnsi"/>
+          <w:sz w:val="24"/>
+          <w:szCs w:val="24"/>
+        </w:rPr>
+        <w:t>7</w:t>
       </w:r>
     </w:p>
     <w:p>
@@ -1657,17 +1660,9 @@
           <w:szCs w:val="24"/>
         </w:rPr>
         <w:drawing>
-          <wp:anchor distT="0" distB="0" distL="114300" distR="114300" simplePos="0" relativeHeight="251672576" behindDoc="0" locked="0" layoutInCell="1" allowOverlap="1" wp14:anchorId="7D0530EA" wp14:editId="6CC09C48">
-            <wp:simplePos x="0" y="0"/>
-            <wp:positionH relativeFrom="column">
-              <wp:posOffset>3268980</wp:posOffset>
-            </wp:positionH>
-            <wp:positionV relativeFrom="paragraph">
-              <wp:posOffset>13335</wp:posOffset>
-            </wp:positionV>
-            <wp:extent cx="3078480" cy="1470829"/>
-            <wp:effectExtent l="0" t="0" r="7620" b="0"/>
-            <wp:wrapSquare wrapText="bothSides"/>
+          <wp:inline distT="0" distB="0" distL="0" distR="0" wp14:anchorId="7D0530EA" wp14:editId="39123459">
+            <wp:extent cx="5963478" cy="2849217"/>
+            <wp:effectExtent l="0" t="0" r="0" b="8890"/>
             <wp:docPr id="883697966" name="Picture 8"/>
             <wp:cNvGraphicFramePr>
               <a:graphicFrameLocks xmlns:a="http://schemas.openxmlformats.org/drawingml/2006/main" noChangeAspect="1"/>
@@ -1694,7 +1689,7 @@
                   <pic:spPr>
                     <a:xfrm>
                       <a:off x="0" y="0"/>
-                      <a:ext cx="3078480" cy="1470829"/>
+                      <a:ext cx="5989027" cy="2861424"/>
                     </a:xfrm>
                     <a:prstGeom prst="rect">
                       <a:avLst/>
@@ -1703,21 +1698,56 @@
                 </pic:pic>
               </a:graphicData>
             </a:graphic>
-          </wp:anchor>
+          </wp:inline>
         </w:drawing>
       </w:r>
       <w:r>
         <w:rPr>
           <w:rFonts w:eastAsiaTheme="minorHAnsi"/>
+          <w:sz w:val="24"/>
+          <w:szCs w:val="24"/>
+        </w:rPr>
+        <w:br w:type="page"/>
+      </w:r>
+    </w:p>
+    <w:p>
+      <w:pPr>
+        <w:rPr>
+          <w:rFonts w:eastAsiaTheme="minorHAnsi"/>
+          <w:sz w:val="24"/>
+          <w:szCs w:val="24"/>
+        </w:rPr>
+      </w:pPr>
+      <w:r>
+        <w:rPr>
+          <w:rFonts w:eastAsiaTheme="minorHAnsi"/>
+          <w:sz w:val="24"/>
+          <w:szCs w:val="24"/>
+        </w:rPr>
+        <w:lastRenderedPageBreak/>
+        <w:t>Please insert picture of DRC clean layout below.</w:t>
+      </w:r>
+    </w:p>
+    <w:p>
+      <w:pPr>
+        <w:rPr>
+          <w:rFonts w:eastAsiaTheme="minorHAnsi"/>
+          <w:sz w:val="24"/>
+          <w:szCs w:val="24"/>
+        </w:rPr>
+      </w:pPr>
+      <w:r>
+        <w:rPr>
+          <w:rFonts w:eastAsiaTheme="minorHAnsi"/>
           <w:noProof/>
           <w:sz w:val="24"/>
           <w:szCs w:val="24"/>
         </w:rPr>
         <w:drawing>
-          <wp:inline distT="0" distB="0" distL="0" distR="0" wp14:anchorId="1233419D" wp14:editId="35392802">
-            <wp:extent cx="3091029" cy="1539240"/>
-            <wp:effectExtent l="0" t="0" r="0" b="3810"/>
-            <wp:docPr id="1856859854" name="Picture 9"/>
+          <wp:inline distT="0" distB="0" distL="0" distR="0" wp14:anchorId="795601E1" wp14:editId="09BA6851">
+            <wp:extent cx="5542059" cy="5746737"/>
+            <wp:effectExtent l="0" t="0" r="1905" b="6985"/>
+            <wp:docPr id="259223877" name="Picture 10"/>
             <wp:cNvGraphicFramePr>
               <a:graphicFrameLocks xmlns:a="http://schemas.openxmlformats.org/drawingml/2006/main" noChangeAspect="1"/>
             </wp:cNvGraphicFramePr>
@@ -1725,11 +1755,11 @@
               <a:graphicData uri="http://schemas.openxmlformats.org/drawingml/2006/picture">
                 <pic:pic xmlns:pic="http://schemas.openxmlformats.org/drawingml/2006/picture">
                   <pic:nvPicPr>
-                    <pic:cNvPr id="1856859854" name="Picture 1856859854"/>
+                    <pic:cNvPr id="259223877" name="Picture 10"/>
                     <pic:cNvPicPr/>
                   </pic:nvPicPr>
                   <pic:blipFill>
-                    <a:blip r:embed="rId15" cstate="print">
+                    <a:blip r:embed="rId15">
                       <a:extLst>
                         <a:ext uri="{28A0092B-C50C-407E-A947-70E740481C1C}">
                           <a14:useLocalDpi xmlns:a14="http://schemas.microsoft.com/office/drawing/2010/main" val="0"/>
@@ -1743,7 +1773,7 @@
                   <pic:spPr>
                     <a:xfrm>
                       <a:off x="0" y="0"/>
-                      <a:ext cx="3094868" cy="1541152"/>
+                      <a:ext cx="5559866" cy="5765202"/>
                     </a:xfrm>
                     <a:prstGeom prst="rect">
                       <a:avLst/>
@@ -1764,22 +1794,31 @@
           <w:szCs w:val="24"/>
         </w:rPr>
       </w:pPr>
-    </w:p>
-    <w:p>
-      <w:pPr>
-        <w:rPr>
-          <w:rFonts w:eastAsiaTheme="minorHAnsi"/>
-          <w:sz w:val="24"/>
-          <w:szCs w:val="24"/>
-        </w:rPr>
-      </w:pPr>
-      <w:r>
-        <w:rPr>
-          <w:rFonts w:eastAsiaTheme="minorHAnsi"/>
-          <w:sz w:val="24"/>
-          <w:szCs w:val="24"/>
-        </w:rPr>
-        <w:t>Please insert picture of DRC clean layout below.</w:t>
+      <w:r>
+        <w:rPr>
+          <w:rFonts w:eastAsiaTheme="minorHAnsi"/>
+          <w:sz w:val="24"/>
+          <w:szCs w:val="24"/>
+        </w:rPr>
+        <w:br w:type="page"/>
+      </w:r>
+    </w:p>
+    <w:p>
+      <w:pPr>
+        <w:rPr>
+          <w:rFonts w:eastAsiaTheme="minorHAnsi"/>
+          <w:sz w:val="24"/>
+          <w:szCs w:val="24"/>
+        </w:rPr>
+      </w:pPr>
+      <w:r>
+        <w:rPr>
+          <w:rFonts w:eastAsiaTheme="minorHAnsi"/>
+          <w:sz w:val="24"/>
+          <w:szCs w:val="24"/>
+        </w:rPr>
+        <w:lastRenderedPageBreak/>
+        <w:t>Please insert a picture of working simulation below.</w:t>
       </w:r>
     </w:p>
     <w:p>
@@ -1797,12 +1836,11 @@
           <w:sz w:val="24"/>
           <w:szCs w:val="24"/>
         </w:rPr>
-        <w:lastRenderedPageBreak/>
         <w:drawing>
-          <wp:inline distT="0" distB="0" distL="0" distR="0" wp14:anchorId="795601E1" wp14:editId="334C6FFD">
-            <wp:extent cx="3611880" cy="2415638"/>
-            <wp:effectExtent l="0" t="0" r="7620" b="3810"/>
-            <wp:docPr id="259223877" name="Picture 10"/>
+          <wp:inline distT="0" distB="0" distL="0" distR="0" wp14:anchorId="1806AFD2" wp14:editId="72772707">
+            <wp:extent cx="5969491" cy="3132814"/>
+            <wp:effectExtent l="0" t="0" r="0" b="0"/>
+            <wp:docPr id="1515707352" name="Picture 11"/>
             <wp:cNvGraphicFramePr>
               <a:graphicFrameLocks xmlns:a="http://schemas.openxmlformats.org/drawingml/2006/main" noChangeAspect="1"/>
             </wp:cNvGraphicFramePr>
@@ -1810,7 +1848,7 @@
               <a:graphicData uri="http://schemas.openxmlformats.org/drawingml/2006/picture">
                 <pic:pic xmlns:pic="http://schemas.openxmlformats.org/drawingml/2006/picture">
                   <pic:nvPicPr>
-                    <pic:cNvPr id="259223877" name="Picture 259223877"/>
+                    <pic:cNvPr id="1515707352" name="Picture 11"/>
                     <pic:cNvPicPr/>
                   </pic:nvPicPr>
                   <pic:blipFill>
@@ -1828,82 +1866,7 @@
                   <pic:spPr>
                     <a:xfrm>
                       <a:off x="0" y="0"/>
-                      <a:ext cx="3624496" cy="2424075"/>
-                    </a:xfrm>
-                    <a:prstGeom prst="rect">
-                      <a:avLst/>
-                    </a:prstGeom>
-                  </pic:spPr>
-                </pic:pic>
-              </a:graphicData>
-            </a:graphic>
-          </wp:inline>
-        </w:drawing>
-      </w:r>
-    </w:p>
-    <w:p>
-      <w:pPr>
-        <w:rPr>
-          <w:rFonts w:eastAsiaTheme="minorHAnsi"/>
-          <w:sz w:val="24"/>
-          <w:szCs w:val="24"/>
-        </w:rPr>
-      </w:pPr>
-      <w:r>
-        <w:rPr>
-          <w:rFonts w:eastAsiaTheme="minorHAnsi"/>
-          <w:sz w:val="24"/>
-          <w:szCs w:val="24"/>
-        </w:rPr>
-        <w:t>Please insert a picture of working simulation below.</w:t>
-      </w:r>
-    </w:p>
-    <w:p>
-      <w:pPr>
-        <w:rPr>
-          <w:rFonts w:eastAsiaTheme="minorHAnsi"/>
-          <w:sz w:val="24"/>
-          <w:szCs w:val="24"/>
-        </w:rPr>
-      </w:pPr>
-      <w:r>
-        <w:rPr>
-          <w:rFonts w:eastAsiaTheme="minorHAnsi"/>
-          <w:noProof/>
-          <w:sz w:val="24"/>
-          <w:szCs w:val="24"/>
-        </w:rPr>
-        <w:drawing>
-          <wp:inline distT="0" distB="0" distL="0" distR="0" wp14:anchorId="1806AFD2" wp14:editId="2BE11963">
-            <wp:extent cx="4700140" cy="2322276"/>
-            <wp:effectExtent l="0" t="0" r="5715" b="1905"/>
-            <wp:docPr id="1515707352" name="Picture 11"/>
-            <wp:cNvGraphicFramePr>
-              <a:graphicFrameLocks xmlns:a="http://schemas.openxmlformats.org/drawingml/2006/main" noChangeAspect="1"/>
-            </wp:cNvGraphicFramePr>
-            <a:graphic xmlns:a="http://schemas.openxmlformats.org/drawingml/2006/main">
-              <a:graphicData uri="http://schemas.openxmlformats.org/drawingml/2006/picture">
-                <pic:pic xmlns:pic="http://schemas.openxmlformats.org/drawingml/2006/picture">
-                  <pic:nvPicPr>
-                    <pic:cNvPr id="1515707352" name="Picture 11"/>
-                    <pic:cNvPicPr/>
-                  </pic:nvPicPr>
-                  <pic:blipFill>
-                    <a:blip r:embed="rId17" cstate="print">
-                      <a:extLst>
-                        <a:ext uri="{28A0092B-C50C-407E-A947-70E740481C1C}">
-                          <a14:useLocalDpi xmlns:a14="http://schemas.microsoft.com/office/drawing/2010/main" val="0"/>
-                        </a:ext>
-                      </a:extLst>
-                    </a:blip>
-                    <a:stretch>
-                      <a:fillRect/>
-                    </a:stretch>
-                  </pic:blipFill>
-                  <pic:spPr>
-                    <a:xfrm>
-                      <a:off x="0" y="0"/>
-                      <a:ext cx="4700140" cy="2322276"/>
+                      <a:ext cx="5999180" cy="3148395"/>
                     </a:xfrm>
                     <a:prstGeom prst="rect">
                       <a:avLst/>
@@ -2181,8 +2144,57 @@
           <w:sz w:val="24"/>
           <w:szCs w:val="24"/>
         </w:rPr>
+        <w:br w:type="page"/>
+      </w:r>
+    </w:p>
+    <w:p>
+      <w:pPr>
+        <w:rPr>
+          <w:rFonts w:eastAsiaTheme="minorHAnsi"/>
+          <w:sz w:val="24"/>
+          <w:szCs w:val="24"/>
+        </w:rPr>
+      </w:pPr>
+      <w:r>
+        <w:rPr>
+          <w:rFonts w:eastAsiaTheme="minorHAnsi"/>
+          <w:sz w:val="24"/>
+          <w:szCs w:val="24"/>
+        </w:rPr>
         <w:lastRenderedPageBreak/>
-        <w:t>Name:                                                                       Design Area WxL =________</w:t>
+        <w:t xml:space="preserve">Name:     </w:t>
+      </w:r>
+      <w:r>
+        <w:rPr>
+          <w:rFonts w:eastAsiaTheme="minorHAnsi"/>
+          <w:sz w:val="24"/>
+          <w:szCs w:val="24"/>
+        </w:rPr>
+        <w:t>Sadeen Faqih</w:t>
+      </w:r>
+      <w:r>
+        <w:rPr>
+          <w:rFonts w:eastAsiaTheme="minorHAnsi"/>
+          <w:sz w:val="24"/>
+          <w:szCs w:val="24"/>
+        </w:rPr>
+        <w:t xml:space="preserve">                                                                  Design Area WxL =</w:t>
+      </w:r>
+      <w:r>
+        <w:rPr>
+          <w:rFonts w:eastAsiaTheme="minorHAnsi"/>
+          <w:sz w:val="24"/>
+          <w:szCs w:val="24"/>
+        </w:rPr>
+        <w:t xml:space="preserve"> </w:t>
+      </w:r>
+      <w:r>
+        <w:rPr>
+          <w:rFonts w:eastAsiaTheme="minorHAnsi"/>
+          <w:sz w:val="24"/>
+          <w:szCs w:val="24"/>
+        </w:rPr>
+        <w:t>70x40</w:t>
       </w:r>
     </w:p>
     <w:p>
@@ -2271,7 +2283,7 @@
           <w:sz w:val="24"/>
           <w:szCs w:val="24"/>
         </w:rPr>
-        <w:t xml:space="preserve">Date: </w:t>
+        <w:t xml:space="preserve"> </w:t>
       </w:r>
     </w:p>
     <w:p>
@@ -2456,21 +2468,65 @@
           <w:szCs w:val="24"/>
         </w:rPr>
       </w:pPr>
-    </w:p>
-    <w:p>
-      <w:pPr>
-        <w:rPr>
-          <w:rFonts w:eastAsiaTheme="minorHAnsi"/>
-          <w:sz w:val="24"/>
-          <w:szCs w:val="24"/>
-        </w:rPr>
-      </w:pPr>
-      <w:r>
-        <w:rPr>
-          <w:rFonts w:eastAsiaTheme="minorHAnsi"/>
-          <w:sz w:val="24"/>
-          <w:szCs w:val="24"/>
-        </w:rPr>
+      <w:r>
+        <w:rPr>
+          <w:rFonts w:eastAsiaTheme="minorHAnsi"/>
+          <w:noProof/>
+          <w:sz w:val="24"/>
+          <w:szCs w:val="24"/>
+        </w:rPr>
+        <w:drawing>
+          <wp:inline distT="0" distB="0" distL="0" distR="0" wp14:anchorId="1290BE02" wp14:editId="4BC5F78B">
+            <wp:extent cx="5009322" cy="3355070"/>
+            <wp:effectExtent l="0" t="0" r="1270" b="0"/>
+            <wp:docPr id="1212762938" name="Picture 1"/>
+            <wp:cNvGraphicFramePr>
+              <a:graphicFrameLocks xmlns:a="http://schemas.openxmlformats.org/drawingml/2006/main" noChangeAspect="1"/>
+            </wp:cNvGraphicFramePr>
+            <a:graphic xmlns:a="http://schemas.openxmlformats.org/drawingml/2006/main">
+              <a:graphicData uri="http://schemas.openxmlformats.org/drawingml/2006/picture">
+                <pic:pic xmlns:pic="http://schemas.openxmlformats.org/drawingml/2006/picture">
+                  <pic:nvPicPr>
+                    <pic:cNvPr id="1212762938" name=""/>
+                    <pic:cNvPicPr/>
+                  </pic:nvPicPr>
+                  <pic:blipFill>
+                    <a:blip r:embed="rId17"/>
+                    <a:stretch>
+                      <a:fillRect/>
+                    </a:stretch>
+                  </pic:blipFill>
+                  <pic:spPr>
+                    <a:xfrm>
+                      <a:off x="0" y="0"/>
+                      <a:ext cx="5028192" cy="3367708"/>
+                    </a:xfrm>
+                    <a:prstGeom prst="rect">
+                      <a:avLst/>
+                    </a:prstGeom>
+                  </pic:spPr>
+                </pic:pic>
+              </a:graphicData>
+            </a:graphic>
+          </wp:inline>
+        </w:drawing>
+      </w:r>
+    </w:p>
+    <w:p>
+      <w:pPr>
+        <w:rPr>
+          <w:rFonts w:eastAsiaTheme="minorHAnsi"/>
+          <w:sz w:val="24"/>
+          <w:szCs w:val="24"/>
+        </w:rPr>
+      </w:pPr>
+      <w:r>
+        <w:rPr>
+          <w:rFonts w:eastAsiaTheme="minorHAnsi"/>
+          <w:sz w:val="24"/>
+          <w:szCs w:val="24"/>
+        </w:rPr>
+        <w:lastRenderedPageBreak/>
         <w:t>Please insert picture of DRC clean layout below.</w:t>
       </w:r>
     </w:p>
@@ -2482,21 +2538,82 @@
           <w:szCs w:val="24"/>
         </w:rPr>
       </w:pPr>
-    </w:p>
-    <w:p>
-      <w:pPr>
-        <w:rPr>
-          <w:rFonts w:eastAsiaTheme="minorHAnsi"/>
-          <w:sz w:val="24"/>
-          <w:szCs w:val="24"/>
-        </w:rPr>
-      </w:pPr>
-      <w:r>
-        <w:rPr>
-          <w:rFonts w:eastAsiaTheme="minorHAnsi"/>
-          <w:sz w:val="24"/>
-          <w:szCs w:val="24"/>
-        </w:rPr>
+      <w:r>
+        <w:rPr>
+          <w:rFonts w:eastAsiaTheme="minorHAnsi"/>
+          <w:noProof/>
+          <w:sz w:val="24"/>
+          <w:szCs w:val="24"/>
+        </w:rPr>
+        <w:drawing>
+          <wp:inline distT="0" distB="0" distL="0" distR="0" wp14:anchorId="078F0267" wp14:editId="1A97A7E5">
+            <wp:extent cx="6133641" cy="3625795"/>
+            <wp:effectExtent l="0" t="0" r="635" b="0"/>
+            <wp:docPr id="840461158" name="Picture 1"/>
+            <wp:cNvGraphicFramePr>
+              <a:graphicFrameLocks xmlns:a="http://schemas.openxmlformats.org/drawingml/2006/main" noChangeAspect="1"/>
+            </wp:cNvGraphicFramePr>
+            <a:graphic xmlns:a="http://schemas.openxmlformats.org/drawingml/2006/main">
+              <a:graphicData uri="http://schemas.openxmlformats.org/drawingml/2006/picture">
+                <pic:pic xmlns:pic="http://schemas.openxmlformats.org/drawingml/2006/picture">
+                  <pic:nvPicPr>
+                    <pic:cNvPr id="840461158" name=""/>
+                    <pic:cNvPicPr/>
+                  </pic:nvPicPr>
+                  <pic:blipFill>
+                    <a:blip r:embed="rId18"/>
+                    <a:stretch>
+                      <a:fillRect/>
+                    </a:stretch>
+                  </pic:blipFill>
+                  <pic:spPr>
+                    <a:xfrm>
+                      <a:off x="0" y="0"/>
+                      <a:ext cx="6149369" cy="3635092"/>
+                    </a:xfrm>
+                    <a:prstGeom prst="rect">
+                      <a:avLst/>
+                    </a:prstGeom>
+                  </pic:spPr>
+                </pic:pic>
+              </a:graphicData>
+            </a:graphic>
+          </wp:inline>
+        </w:drawing>
+      </w:r>
+    </w:p>
+    <w:p>
+      <w:pPr>
+        <w:rPr>
+          <w:rFonts w:eastAsiaTheme="minorHAnsi"/>
+          <w:sz w:val="24"/>
+          <w:szCs w:val="24"/>
+        </w:rPr>
+      </w:pPr>
+      <w:r>
+        <w:rPr>
+          <w:rFonts w:eastAsiaTheme="minorHAnsi"/>
+          <w:sz w:val="24"/>
+          <w:szCs w:val="24"/>
+        </w:rPr>
+        <w:br w:type="page"/>
+      </w:r>
+    </w:p>
+    <w:p>
+      <w:pPr>
+        <w:rPr>
+          <w:rFonts w:eastAsiaTheme="minorHAnsi"/>
+          <w:sz w:val="24"/>
+          <w:szCs w:val="24"/>
+        </w:rPr>
+      </w:pPr>
+      <w:r>
+        <w:rPr>
+          <w:rFonts w:eastAsiaTheme="minorHAnsi"/>
+          <w:sz w:val="24"/>
+          <w:szCs w:val="24"/>
+        </w:rPr>
+        <w:lastRenderedPageBreak/>
         <w:t>Please insert a picture of working simulation below.</w:t>
       </w:r>
     </w:p>
@@ -2508,6 +2625,49 @@
           <w:szCs w:val="24"/>
         </w:rPr>
       </w:pPr>
+      <w:r>
+        <w:rPr>
+          <w:rFonts w:eastAsiaTheme="minorHAnsi"/>
+          <w:noProof/>
+          <w:sz w:val="24"/>
+          <w:szCs w:val="24"/>
+        </w:rPr>
+        <w:drawing>
+          <wp:inline distT="0" distB="0" distL="0" distR="0" wp14:anchorId="28AE831E" wp14:editId="4491F559">
+            <wp:extent cx="5943600" cy="3115310"/>
+            <wp:effectExtent l="0" t="0" r="0" b="8890"/>
+            <wp:docPr id="2069714323" name="Picture 1"/>
+            <wp:cNvGraphicFramePr>
+              <a:graphicFrameLocks xmlns:a="http://schemas.openxmlformats.org/drawingml/2006/main" noChangeAspect="1"/>
+            </wp:cNvGraphicFramePr>
+            <a:graphic xmlns:a="http://schemas.openxmlformats.org/drawingml/2006/main">
+              <a:graphicData uri="http://schemas.openxmlformats.org/drawingml/2006/picture">
+                <pic:pic xmlns:pic="http://schemas.openxmlformats.org/drawingml/2006/picture">
+                  <pic:nvPicPr>
+                    <pic:cNvPr id="2069714323" name=""/>
+                    <pic:cNvPicPr/>
+                  </pic:nvPicPr>
+                  <pic:blipFill>
+                    <a:blip r:embed="rId19"/>
+                    <a:stretch>
+                      <a:fillRect/>
+                    </a:stretch>
+                  </pic:blipFill>
+                  <pic:spPr>
+                    <a:xfrm>
+                      <a:off x="0" y="0"/>
+                      <a:ext cx="5943600" cy="3115310"/>
+                    </a:xfrm>
+                    <a:prstGeom prst="rect">
+                      <a:avLst/>
+                    </a:prstGeom>
+                  </pic:spPr>
+                </pic:pic>
+              </a:graphicData>
+            </a:graphic>
+          </wp:inline>
+        </w:drawing>
+      </w:r>
     </w:p>
     <w:p>
       <w:pPr>
@@ -2685,6 +2845,14 @@
                 <w:szCs w:val="24"/>
               </w:rPr>
             </w:pPr>
+            <w:r>
+              <w:rPr>
+                <w:rFonts w:eastAsiaTheme="minorHAnsi"/>
+                <w:sz w:val="24"/>
+                <w:szCs w:val="24"/>
+              </w:rPr>
+              <w:t>0</w:t>
+            </w:r>
           </w:p>
         </w:tc>
         <w:tc>
@@ -2699,6 +2867,14 @@
                 <w:szCs w:val="24"/>
               </w:rPr>
             </w:pPr>
+            <w:r>
+              <w:rPr>
+                <w:rFonts w:eastAsiaTheme="minorHAnsi"/>
+                <w:sz w:val="24"/>
+                <w:szCs w:val="24"/>
+              </w:rPr>
+              <w:t>YES</w:t>
+            </w:r>
           </w:p>
         </w:tc>
       </w:tr>
@@ -2759,6 +2935,14 @@
                 <w:szCs w:val="24"/>
               </w:rPr>
             </w:pPr>
+            <w:r>
+              <w:rPr>
+                <w:rFonts w:eastAsiaTheme="minorHAnsi"/>
+                <w:sz w:val="24"/>
+                <w:szCs w:val="24"/>
+              </w:rPr>
+              <w:t>0</w:t>
+            </w:r>
           </w:p>
         </w:tc>
         <w:tc>
@@ -2773,6 +2957,14 @@
                 <w:szCs w:val="24"/>
               </w:rPr>
             </w:pPr>
+            <w:r>
+              <w:rPr>
+                <w:rFonts w:eastAsiaTheme="minorHAnsi"/>
+                <w:sz w:val="24"/>
+                <w:szCs w:val="24"/>
+              </w:rPr>
+              <w:t>YES</w:t>
+            </w:r>
           </w:p>
         </w:tc>
       </w:tr>
@@ -2833,6 +3025,14 @@
                 <w:szCs w:val="24"/>
               </w:rPr>
             </w:pPr>
+            <w:r>
+              <w:rPr>
+                <w:rFonts w:eastAsiaTheme="minorHAnsi"/>
+                <w:sz w:val="24"/>
+                <w:szCs w:val="24"/>
+              </w:rPr>
+              <w:t>0</w:t>
+            </w:r>
           </w:p>
         </w:tc>
         <w:tc>
@@ -2847,6 +3047,14 @@
                 <w:szCs w:val="24"/>
               </w:rPr>
             </w:pPr>
+            <w:r>
+              <w:rPr>
+                <w:rFonts w:eastAsiaTheme="minorHAnsi"/>
+                <w:sz w:val="24"/>
+                <w:szCs w:val="24"/>
+              </w:rPr>
+              <w:t>YES</w:t>
+            </w:r>
           </w:p>
         </w:tc>
       </w:tr>
@@ -2907,6 +3115,14 @@
                 <w:szCs w:val="24"/>
               </w:rPr>
             </w:pPr>
+            <w:r>
+              <w:rPr>
+                <w:rFonts w:eastAsiaTheme="minorHAnsi"/>
+                <w:sz w:val="24"/>
+                <w:szCs w:val="24"/>
+              </w:rPr>
+              <w:t>1</w:t>
+            </w:r>
           </w:p>
         </w:tc>
         <w:tc>
@@ -2921,6 +3137,14 @@
                 <w:szCs w:val="24"/>
               </w:rPr>
             </w:pPr>
+            <w:r>
+              <w:rPr>
+                <w:rFonts w:eastAsiaTheme="minorHAnsi"/>
+                <w:sz w:val="24"/>
+                <w:szCs w:val="24"/>
+              </w:rPr>
+              <w:t>YES</w:t>
+            </w:r>
           </w:p>
         </w:tc>
       </w:tr>
@@ -2933,13 +3157,56 @@
           <w:szCs w:val="24"/>
         </w:rPr>
       </w:pPr>
-      <w:r>
-        <w:rPr>
-          <w:rFonts w:eastAsiaTheme="minorHAnsi"/>
-          <w:sz w:val="24"/>
-          <w:szCs w:val="24"/>
-        </w:rPr>
-        <w:t>Name:                                                         Design Area WxL =________</w:t>
+    </w:p>
+    <w:p>
+      <w:pPr>
+        <w:rPr>
+          <w:rFonts w:eastAsiaTheme="minorHAnsi"/>
+          <w:sz w:val="24"/>
+          <w:szCs w:val="24"/>
+        </w:rPr>
+      </w:pPr>
+      <w:r>
+        <w:rPr>
+          <w:rFonts w:eastAsiaTheme="minorHAnsi"/>
+          <w:sz w:val="24"/>
+          <w:szCs w:val="24"/>
+        </w:rPr>
+        <w:br w:type="page"/>
+      </w:r>
+    </w:p>
+    <w:p>
+      <w:pPr>
+        <w:rPr>
+          <w:rFonts w:eastAsiaTheme="minorHAnsi"/>
+          <w:sz w:val="24"/>
+          <w:szCs w:val="24"/>
+        </w:rPr>
+      </w:pPr>
+      <w:r>
+        <w:rPr>
+          <w:rFonts w:eastAsiaTheme="minorHAnsi"/>
+          <w:sz w:val="24"/>
+          <w:szCs w:val="24"/>
+        </w:rPr>
+        <w:lastRenderedPageBreak/>
+        <w:t xml:space="preserve">Name:     </w:t>
+      </w:r>
+      <w:r>
+        <w:rPr>
+          <w:rFonts w:eastAsiaTheme="minorHAnsi"/>
+          <w:sz w:val="24"/>
+          <w:szCs w:val="24"/>
+        </w:rPr>
+        <w:t>Lana Sayes</w:t>
+      </w:r>
+      <w:r>
+        <w:rPr>
+          <w:rFonts w:eastAsiaTheme="minorHAnsi"/>
+          <w:sz w:val="24"/>
+          <w:szCs w:val="24"/>
+        </w:rPr>
+        <w:t xml:space="preserve">                                                    Design Area WxL =________</w:t>
       </w:r>
     </w:p>
     <w:p>
@@ -2957,7 +3224,6 @@
           <w:sz w:val="24"/>
           <w:szCs w:val="24"/>
         </w:rPr>
-        <w:lastRenderedPageBreak/>
         <mc:AlternateContent>
           <mc:Choice Requires="wps">
             <w:drawing>
@@ -3030,7 +3296,7 @@
           <w:sz w:val="24"/>
           <w:szCs w:val="24"/>
         </w:rPr>
-        <w:t xml:space="preserve">Date: </w:t>
+        <w:t xml:space="preserve"> </w:t>
       </w:r>
     </w:p>
     <w:p>
@@ -3073,7 +3339,7 @@
           <w:szCs w:val="24"/>
         </w:rPr>
         <w:drawing>
-          <wp:inline distT="0" distB="0" distL="0" distR="0" wp14:anchorId="071C2B5C" wp14:editId="3E285211">
+          <wp:inline distT="0" distB="0" distL="0" distR="0" wp14:anchorId="071C2B5C" wp14:editId="416DE280">
             <wp:extent cx="1838325" cy="822068"/>
             <wp:effectExtent l="0" t="0" r="0" b="0"/>
             <wp:docPr id="12" name="Picture 12"/>
@@ -3268,6 +3534,24 @@
           <w:sz w:val="24"/>
           <w:szCs w:val="24"/>
         </w:rPr>
+        <w:br w:type="page"/>
+      </w:r>
+    </w:p>
+    <w:p>
+      <w:pPr>
+        <w:rPr>
+          <w:rFonts w:eastAsiaTheme="minorHAnsi"/>
+          <w:sz w:val="24"/>
+          <w:szCs w:val="24"/>
+        </w:rPr>
+      </w:pPr>
+      <w:r>
+        <w:rPr>
+          <w:rFonts w:eastAsiaTheme="minorHAnsi"/>
+          <w:sz w:val="24"/>
+          <w:szCs w:val="24"/>
+        </w:rPr>
+        <w:lastRenderedPageBreak/>
         <w:t>Please insert picture of DRC clean layout below.</w:t>
       </w:r>
     </w:p>
@@ -3294,6 +3578,24 @@
           <w:sz w:val="24"/>
           <w:szCs w:val="24"/>
         </w:rPr>
+        <w:br w:type="page"/>
+      </w:r>
+    </w:p>
+    <w:p>
+      <w:pPr>
+        <w:rPr>
+          <w:rFonts w:eastAsiaTheme="minorHAnsi"/>
+          <w:sz w:val="24"/>
+          <w:szCs w:val="24"/>
+        </w:rPr>
+      </w:pPr>
+      <w:r>
+        <w:rPr>
+          <w:rFonts w:eastAsiaTheme="minorHAnsi"/>
+          <w:sz w:val="24"/>
+          <w:szCs w:val="24"/>
+        </w:rPr>
+        <w:lastRenderedPageBreak/>
         <w:t>Please insert a picture of working simulation below.</w:t>
       </w:r>
     </w:p>
@@ -3739,13 +4041,64 @@
           <w:szCs w:val="24"/>
         </w:rPr>
       </w:pPr>
-      <w:r>
-        <w:rPr>
-          <w:rFonts w:eastAsiaTheme="minorHAnsi"/>
-          <w:sz w:val="24"/>
-          <w:szCs w:val="24"/>
-        </w:rPr>
-        <w:t>Name:                                                                          Design Area WxL =________</w:t>
+    </w:p>
+    <w:p>
+      <w:pPr>
+        <w:rPr>
+          <w:rFonts w:eastAsiaTheme="minorHAnsi"/>
+          <w:sz w:val="24"/>
+          <w:szCs w:val="24"/>
+        </w:rPr>
+      </w:pPr>
+      <w:r>
+        <w:rPr>
+          <w:rFonts w:eastAsiaTheme="minorHAnsi"/>
+          <w:sz w:val="24"/>
+          <w:szCs w:val="24"/>
+        </w:rPr>
+        <w:br w:type="page"/>
+      </w:r>
+    </w:p>
+    <w:p>
+      <w:pPr>
+        <w:rPr>
+          <w:rFonts w:eastAsiaTheme="minorHAnsi"/>
+          <w:sz w:val="24"/>
+          <w:szCs w:val="24"/>
+        </w:rPr>
+      </w:pPr>
+      <w:r>
+        <w:rPr>
+          <w:rFonts w:eastAsiaTheme="minorHAnsi"/>
+          <w:sz w:val="24"/>
+          <w:szCs w:val="24"/>
+        </w:rPr>
+        <w:lastRenderedPageBreak/>
+        <w:t xml:space="preserve">Name:  </w:t>
+      </w:r>
+      <w:r>
+        <w:rPr>
+          <w:rFonts w:eastAsiaTheme="minorHAnsi"/>
+          <w:sz w:val="24"/>
+          <w:szCs w:val="24"/>
+        </w:rPr>
+        <w:t>Kareem Hamza</w:t>
+      </w:r>
+      <w:r>
+        <w:rPr>
+          <w:rFonts w:eastAsiaTheme="minorHAnsi"/>
+          <w:sz w:val="24"/>
+          <w:szCs w:val="24"/>
+        </w:rPr>
+        <w:t xml:space="preserve">                                                              Design Area WxL =</w:t>
+      </w:r>
+      <w:r>
+        <w:rPr>
+          <w:rFonts w:eastAsiaTheme="minorHAnsi"/>
+          <w:sz w:val="24"/>
+          <w:szCs w:val="24"/>
+        </w:rPr>
+        <w:t>32x40</w:t>
       </w:r>
     </w:p>
     <w:p>
@@ -3763,7 +4116,6 @@
           <w:sz w:val="24"/>
           <w:szCs w:val="24"/>
         </w:rPr>
-        <w:lastRenderedPageBreak/>
         <mc:AlternateContent>
           <mc:Choice Requires="wps">
             <w:drawing>
@@ -3829,14 +4181,6 @@
           </mc:Fallback>
         </mc:AlternateContent>
       </w:r>
-      <w:r>
-        <w:rPr>
-          <w:rFonts w:eastAsiaTheme="minorHAnsi"/>
-          <w:sz w:val="24"/>
-          <w:szCs w:val="24"/>
-        </w:rPr>
-        <w:t xml:space="preserve">Date: </w:t>
-      </w:r>
     </w:p>
     <w:p>
       <w:pPr>
@@ -4036,21 +4380,71 @@
           <w:szCs w:val="24"/>
         </w:rPr>
       </w:pPr>
-    </w:p>
-    <w:p>
-      <w:pPr>
-        <w:rPr>
-          <w:rFonts w:eastAsiaTheme="minorHAnsi"/>
-          <w:sz w:val="24"/>
-          <w:szCs w:val="24"/>
-        </w:rPr>
-      </w:pPr>
-      <w:r>
-        <w:rPr>
-          <w:rFonts w:eastAsiaTheme="minorHAnsi"/>
-          <w:sz w:val="24"/>
-          <w:szCs w:val="24"/>
-        </w:rPr>
+      <w:r>
+        <w:rPr>
+          <w:rFonts w:eastAsiaTheme="minorHAnsi"/>
+          <w:noProof/>
+          <w:sz w:val="24"/>
+          <w:szCs w:val="24"/>
+        </w:rPr>
+        <w:drawing>
+          <wp:inline distT="0" distB="0" distL="0" distR="0" wp14:anchorId="05824CAB" wp14:editId="7120FCBE">
+            <wp:extent cx="4466979" cy="3355612"/>
+            <wp:effectExtent l="0" t="0" r="0" b="0"/>
+            <wp:docPr id="1291065856" name="Picture 1"/>
+            <wp:cNvGraphicFramePr>
+              <a:graphicFrameLocks xmlns:a="http://schemas.openxmlformats.org/drawingml/2006/main" noChangeAspect="1"/>
+            </wp:cNvGraphicFramePr>
+            <a:graphic xmlns:a="http://schemas.openxmlformats.org/drawingml/2006/main">
+              <a:graphicData uri="http://schemas.openxmlformats.org/drawingml/2006/picture">
+                <pic:pic xmlns:pic="http://schemas.openxmlformats.org/drawingml/2006/picture">
+                  <pic:nvPicPr>
+                    <pic:cNvPr id="1291065856" name="Picture 1"/>
+                    <pic:cNvPicPr/>
+                  </pic:nvPicPr>
+                  <pic:blipFill>
+                    <a:blip r:embed="rId20">
+                      <a:extLst>
+                        <a:ext uri="{28A0092B-C50C-407E-A947-70E740481C1C}">
+                          <a14:useLocalDpi xmlns:a14="http://schemas.microsoft.com/office/drawing/2010/main" val="0"/>
+                        </a:ext>
+                      </a:extLst>
+                    </a:blip>
+                    <a:stretch>
+                      <a:fillRect/>
+                    </a:stretch>
+                  </pic:blipFill>
+                  <pic:spPr>
+                    <a:xfrm>
+                      <a:off x="0" y="0"/>
+                      <a:ext cx="4466979" cy="3355612"/>
+                    </a:xfrm>
+                    <a:prstGeom prst="rect">
+                      <a:avLst/>
+                    </a:prstGeom>
+                  </pic:spPr>
+                </pic:pic>
+              </a:graphicData>
+            </a:graphic>
+          </wp:inline>
+        </w:drawing>
+      </w:r>
+    </w:p>
+    <w:p>
+      <w:pPr>
+        <w:rPr>
+          <w:rFonts w:eastAsiaTheme="minorHAnsi"/>
+          <w:sz w:val="24"/>
+          <w:szCs w:val="24"/>
+        </w:rPr>
+      </w:pPr>
+      <w:r>
+        <w:rPr>
+          <w:rFonts w:eastAsiaTheme="minorHAnsi"/>
+          <w:sz w:val="24"/>
+          <w:szCs w:val="24"/>
+        </w:rPr>
+        <w:lastRenderedPageBreak/>
         <w:t>Please insert picture of DRC clean layout below.</w:t>
       </w:r>
     </w:p>
@@ -4062,21 +4456,73 @@
           <w:szCs w:val="24"/>
         </w:rPr>
       </w:pPr>
-    </w:p>
-    <w:p>
-      <w:pPr>
-        <w:rPr>
-          <w:rFonts w:eastAsiaTheme="minorHAnsi"/>
-          <w:sz w:val="24"/>
-          <w:szCs w:val="24"/>
-        </w:rPr>
-      </w:pPr>
-      <w:r>
-        <w:rPr>
-          <w:rFonts w:eastAsiaTheme="minorHAnsi"/>
-          <w:sz w:val="24"/>
-          <w:szCs w:val="24"/>
-        </w:rPr>
+      <w:r>
+        <w:rPr>
+          <w:rFonts w:eastAsiaTheme="minorHAnsi"/>
+          <w:noProof/>
+          <w:sz w:val="24"/>
+          <w:szCs w:val="24"/>
+        </w:rPr>
+        <w:drawing>
+          <wp:inline distT="0" distB="0" distL="0" distR="0" wp14:anchorId="497F4496" wp14:editId="48A39F17">
+            <wp:extent cx="4905955" cy="6281196"/>
+            <wp:effectExtent l="0" t="0" r="9525" b="5715"/>
+            <wp:docPr id="978134499" name="Picture 1"/>
+            <wp:cNvGraphicFramePr>
+              <a:graphicFrameLocks xmlns:a="http://schemas.openxmlformats.org/drawingml/2006/main" noChangeAspect="1"/>
+            </wp:cNvGraphicFramePr>
+            <a:graphic xmlns:a="http://schemas.openxmlformats.org/drawingml/2006/main">
+              <a:graphicData uri="http://schemas.openxmlformats.org/drawingml/2006/picture">
+                <pic:pic xmlns:pic="http://schemas.openxmlformats.org/drawingml/2006/picture">
+                  <pic:nvPicPr>
+                    <pic:cNvPr id="978134499" name=""/>
+                    <pic:cNvPicPr/>
+                  </pic:nvPicPr>
+                  <pic:blipFill>
+                    <a:blip r:embed="rId21"/>
+                    <a:stretch>
+                      <a:fillRect/>
+                    </a:stretch>
+                  </pic:blipFill>
+                  <pic:spPr>
+                    <a:xfrm>
+                      <a:off x="0" y="0"/>
+                      <a:ext cx="4981910" cy="6378443"/>
+                    </a:xfrm>
+                    <a:prstGeom prst="rect">
+                      <a:avLst/>
+                    </a:prstGeom>
+                  </pic:spPr>
+                </pic:pic>
+              </a:graphicData>
+            </a:graphic>
+          </wp:inline>
+        </w:drawing>
+      </w:r>
+    </w:p>
+    <w:p>
+      <w:pPr>
+        <w:rPr>
+          <w:rFonts w:eastAsiaTheme="minorHAnsi"/>
+          <w:sz w:val="24"/>
+          <w:szCs w:val="24"/>
+        </w:rPr>
+      </w:pPr>
+      <w:r>
+        <w:rPr>
+          <w:rFonts w:eastAsiaTheme="minorHAnsi"/>
+          <w:sz w:val="24"/>
+          <w:szCs w:val="24"/>
+        </w:rPr>
+        <w:br w:type="page"/>
+      </w:r>
+      <w:r>
+        <w:rPr>
+          <w:rFonts w:eastAsiaTheme="minorHAnsi"/>
+          <w:sz w:val="24"/>
+          <w:szCs w:val="24"/>
+        </w:rPr>
+        <w:lastRenderedPageBreak/>
         <w:t>Please insert a picture of working simulation below.</w:t>
       </w:r>
     </w:p>
@@ -4088,6 +4534,49 @@
           <w:szCs w:val="24"/>
         </w:rPr>
       </w:pPr>
+      <w:r>
+        <w:rPr>
+          <w:rFonts w:eastAsiaTheme="minorHAnsi"/>
+          <w:noProof/>
+          <w:sz w:val="24"/>
+          <w:szCs w:val="24"/>
+        </w:rPr>
+        <w:drawing>
+          <wp:inline distT="0" distB="0" distL="0" distR="0" wp14:anchorId="4E858608" wp14:editId="0ED8C368">
+            <wp:extent cx="6039085" cy="3045350"/>
+            <wp:effectExtent l="0" t="0" r="0" b="3175"/>
+            <wp:docPr id="2023738370" name="Picture 1"/>
+            <wp:cNvGraphicFramePr>
+              <a:graphicFrameLocks xmlns:a="http://schemas.openxmlformats.org/drawingml/2006/main" noChangeAspect="1"/>
+            </wp:cNvGraphicFramePr>
+            <a:graphic xmlns:a="http://schemas.openxmlformats.org/drawingml/2006/main">
+              <a:graphicData uri="http://schemas.openxmlformats.org/drawingml/2006/picture">
+                <pic:pic xmlns:pic="http://schemas.openxmlformats.org/drawingml/2006/picture">
+                  <pic:nvPicPr>
+                    <pic:cNvPr id="2023738370" name=""/>
+                    <pic:cNvPicPr/>
+                  </pic:nvPicPr>
+                  <pic:blipFill>
+                    <a:blip r:embed="rId22"/>
+                    <a:stretch>
+                      <a:fillRect/>
+                    </a:stretch>
+                  </pic:blipFill>
+                  <pic:spPr>
+                    <a:xfrm>
+                      <a:off x="0" y="0"/>
+                      <a:ext cx="6082845" cy="3067417"/>
+                    </a:xfrm>
+                    <a:prstGeom prst="rect">
+                      <a:avLst/>
+                    </a:prstGeom>
+                  </pic:spPr>
+                </pic:pic>
+              </a:graphicData>
+            </a:graphic>
+          </wp:inline>
+        </w:drawing>
+      </w:r>
     </w:p>
     <w:p>
       <w:pPr>
@@ -4265,6 +4754,14 @@
                 <w:szCs w:val="24"/>
               </w:rPr>
             </w:pPr>
+            <w:r>
+              <w:rPr>
+                <w:rFonts w:eastAsiaTheme="minorHAnsi"/>
+                <w:sz w:val="24"/>
+                <w:szCs w:val="24"/>
+              </w:rPr>
+              <w:t>1</w:t>
+            </w:r>
           </w:p>
         </w:tc>
         <w:tc>
@@ -4279,6 +4776,14 @@
                 <w:szCs w:val="24"/>
               </w:rPr>
             </w:pPr>
+            <w:r>
+              <w:rPr>
+                <w:rFonts w:eastAsiaTheme="minorHAnsi"/>
+                <w:sz w:val="24"/>
+                <w:szCs w:val="24"/>
+              </w:rPr>
+              <w:t>YES</w:t>
+            </w:r>
           </w:p>
         </w:tc>
       </w:tr>
@@ -4339,6 +4844,14 @@
                 <w:szCs w:val="24"/>
               </w:rPr>
             </w:pPr>
+            <w:r>
+              <w:rPr>
+                <w:rFonts w:eastAsiaTheme="minorHAnsi"/>
+                <w:sz w:val="24"/>
+                <w:szCs w:val="24"/>
+              </w:rPr>
+              <w:t>0</w:t>
+            </w:r>
           </w:p>
         </w:tc>
         <w:tc>
@@ -4353,6 +4866,14 @@
                 <w:szCs w:val="24"/>
               </w:rPr>
             </w:pPr>
+            <w:r>
+              <w:rPr>
+                <w:rFonts w:eastAsiaTheme="minorHAnsi"/>
+                <w:sz w:val="24"/>
+                <w:szCs w:val="24"/>
+              </w:rPr>
+              <w:t>YES</w:t>
+            </w:r>
           </w:p>
         </w:tc>
       </w:tr>
@@ -4413,6 +4934,14 @@
                 <w:szCs w:val="24"/>
               </w:rPr>
             </w:pPr>
+            <w:r>
+              <w:rPr>
+                <w:rFonts w:eastAsiaTheme="minorHAnsi"/>
+                <w:sz w:val="24"/>
+                <w:szCs w:val="24"/>
+              </w:rPr>
+              <w:t>0</w:t>
+            </w:r>
           </w:p>
         </w:tc>
         <w:tc>
@@ -4427,6 +4956,14 @@
                 <w:szCs w:val="24"/>
               </w:rPr>
             </w:pPr>
+            <w:r>
+              <w:rPr>
+                <w:rFonts w:eastAsiaTheme="minorHAnsi"/>
+                <w:sz w:val="24"/>
+                <w:szCs w:val="24"/>
+              </w:rPr>
+              <w:t>YES</w:t>
+            </w:r>
           </w:p>
         </w:tc>
       </w:tr>
@@ -4487,6 +5024,14 @@
                 <w:szCs w:val="24"/>
               </w:rPr>
             </w:pPr>
+            <w:r>
+              <w:rPr>
+                <w:rFonts w:eastAsiaTheme="minorHAnsi"/>
+                <w:sz w:val="24"/>
+                <w:szCs w:val="24"/>
+              </w:rPr>
+              <w:t>0</w:t>
+            </w:r>
           </w:p>
         </w:tc>
         <w:tc>
@@ -4501,64 +5046,14 @@
                 <w:szCs w:val="24"/>
               </w:rPr>
             </w:pPr>
-          </w:p>
-        </w:tc>
-      </w:tr>
-      <w:tr>
-        <w:tc>
-          <w:tcPr>
-            <w:tcW w:w="2155" w:type="dxa"/>
-          </w:tcPr>
-          <w:p>
-            <w:pPr>
-              <w:rPr>
-                <w:rFonts w:eastAsiaTheme="minorHAnsi"/>
-                <w:sz w:val="24"/>
-                <w:szCs w:val="24"/>
-              </w:rPr>
-            </w:pPr>
-          </w:p>
-        </w:tc>
-        <w:tc>
-          <w:tcPr>
-            <w:tcW w:w="2437" w:type="dxa"/>
-          </w:tcPr>
-          <w:p>
-            <w:pPr>
-              <w:rPr>
-                <w:rFonts w:eastAsiaTheme="minorHAnsi"/>
-                <w:sz w:val="24"/>
-                <w:szCs w:val="24"/>
-              </w:rPr>
-            </w:pPr>
-          </w:p>
-        </w:tc>
-        <w:tc>
-          <w:tcPr>
-            <w:tcW w:w="2657" w:type="dxa"/>
-          </w:tcPr>
-          <w:p>
-            <w:pPr>
-              <w:rPr>
-                <w:rFonts w:eastAsiaTheme="minorHAnsi"/>
-                <w:sz w:val="24"/>
-                <w:szCs w:val="24"/>
-              </w:rPr>
-            </w:pPr>
-          </w:p>
-        </w:tc>
-        <w:tc>
-          <w:tcPr>
-            <w:tcW w:w="2101" w:type="dxa"/>
-          </w:tcPr>
-          <w:p>
-            <w:pPr>
-              <w:rPr>
-                <w:rFonts w:eastAsiaTheme="minorHAnsi"/>
-                <w:sz w:val="24"/>
-                <w:szCs w:val="24"/>
-              </w:rPr>
-            </w:pPr>
+            <w:r>
+              <w:rPr>
+                <w:rFonts w:eastAsiaTheme="minorHAnsi"/>
+                <w:sz w:val="24"/>
+                <w:szCs w:val="24"/>
+              </w:rPr>
+              <w:t>YES</w:t>
+            </w:r>
           </w:p>
         </w:tc>
       </w:tr>
@@ -4595,8 +5090,49 @@
           <w:sz w:val="24"/>
           <w:szCs w:val="24"/>
         </w:rPr>
+        <w:br w:type="page"/>
+      </w:r>
+    </w:p>
+    <w:p>
+      <w:pPr>
+        <w:rPr>
+          <w:rFonts w:eastAsiaTheme="minorHAnsi"/>
+          <w:sz w:val="24"/>
+          <w:szCs w:val="24"/>
+        </w:rPr>
+      </w:pPr>
+      <w:r>
+        <w:rPr>
+          <w:rFonts w:eastAsiaTheme="minorHAnsi"/>
+          <w:sz w:val="24"/>
+          <w:szCs w:val="24"/>
+        </w:rPr>
         <w:lastRenderedPageBreak/>
-        <w:t>Name:                                                                          Design Area WxL =________</w:t>
+        <w:t xml:space="preserve">Name:     </w:t>
+      </w:r>
+      <w:r>
+        <w:rPr>
+          <w:rFonts w:eastAsiaTheme="minorHAnsi"/>
+          <w:sz w:val="24"/>
+          <w:szCs w:val="24"/>
+        </w:rPr>
+        <w:t>Mohyeddin</w:t>
+      </w:r>
+      <w:r>
+        <w:rPr>
+          <w:rFonts w:eastAsiaTheme="minorHAnsi"/>
+          <w:sz w:val="24"/>
+          <w:szCs w:val="24"/>
+        </w:rPr>
+        <w:t xml:space="preserve"> Barghouti</w:t>
+      </w:r>
+      <w:r>
+        <w:rPr>
+          <w:rFonts w:eastAsiaTheme="minorHAnsi"/>
+          <w:sz w:val="24"/>
+          <w:szCs w:val="24"/>
+        </w:rPr>
+        <w:t xml:space="preserve">                                                 Design Area WxL =________</w:t>
       </w:r>
     </w:p>
     <w:p>
@@ -4685,7 +5221,7 @@
           <w:sz w:val="24"/>
           <w:szCs w:val="24"/>
         </w:rPr>
-        <w:t xml:space="preserve">Date: </w:t>
+        <w:t xml:space="preserve"> </w:t>
       </w:r>
     </w:p>
     <w:p>
@@ -4907,6 +5443,24 @@
           <w:sz w:val="24"/>
           <w:szCs w:val="24"/>
         </w:rPr>
+        <w:br w:type="page"/>
+      </w:r>
+    </w:p>
+    <w:p>
+      <w:pPr>
+        <w:rPr>
+          <w:rFonts w:eastAsiaTheme="minorHAnsi"/>
+          <w:sz w:val="24"/>
+          <w:szCs w:val="24"/>
+        </w:rPr>
+      </w:pPr>
+      <w:r>
+        <w:rPr>
+          <w:rFonts w:eastAsiaTheme="minorHAnsi"/>
+          <w:sz w:val="24"/>
+          <w:szCs w:val="24"/>
+        </w:rPr>
+        <w:lastRenderedPageBreak/>
         <w:t>Please insert picture of DRC clean layout below.</w:t>
       </w:r>
     </w:p>
@@ -4933,6 +5487,24 @@
           <w:sz w:val="24"/>
           <w:szCs w:val="24"/>
         </w:rPr>
+        <w:br w:type="page"/>
+      </w:r>
+    </w:p>
+    <w:p>
+      <w:pPr>
+        <w:rPr>
+          <w:rFonts w:eastAsiaTheme="minorHAnsi"/>
+          <w:sz w:val="24"/>
+          <w:szCs w:val="24"/>
+        </w:rPr>
+      </w:pPr>
+      <w:r>
+        <w:rPr>
+          <w:rFonts w:eastAsiaTheme="minorHAnsi"/>
+          <w:sz w:val="24"/>
+          <w:szCs w:val="24"/>
+        </w:rPr>
+        <w:lastRenderedPageBreak/>
         <w:t>Please insert a picture of working simulation below.</w:t>
       </w:r>
     </w:p>
@@ -5400,8 +5972,8 @@
       </w:pPr>
     </w:p>
     <w:sectPr>
-      <w:headerReference w:type="default" r:id="rId18"/>
-      <w:footerReference w:type="default" r:id="rId19"/>
+      <w:headerReference w:type="default" r:id="rId23"/>
+      <w:footerReference w:type="default" r:id="rId24"/>
       <w:pgSz w:w="12240" w:h="15840"/>
       <w:pgMar w:top="1440" w:right="1440" w:bottom="1440" w:left="1440" w:header="720" w:footer="720" w:gutter="0"/>
       <w:pgBorders w:offsetFrom="page">
@@ -5420,7 +5992,7 @@
 </file>
 
 <file path=word/endnotes.xml><?xml version="1.0" encoding="utf-8"?>
-<w:endnotes xmlns:wpc="http://schemas.microsoft.com/office/word/2010/wordprocessingCanvas" xmlns:cx="http://schemas.microsoft.com/office/drawing/2014/chartex" xmlns:cx1="http://schemas.microsoft.com/office/drawing/2015/9/8/chartex" xmlns:cx2="http://schemas.microsoft.com/office/drawing/2015/10/21/chartex" xmlns:cx3="http://schemas.microsoft.com/office/drawing/2016/5/9/chartex" xmlns:cx4="http://schemas.microsoft.com/office/drawing/2016/5/10/chartex" xmlns:cx5="http://schemas.microsoft.com/office/drawing/2016/5/11/chartex" xmlns:cx6="http://schemas.microsoft.com/office/drawing/2016/5/12/chartex" xmlns:cx7="http://schemas.microsoft.com/office/drawing/2016/5/13/chartex" xmlns:cx8="http://schemas.microsoft.com/office/drawing/2016/5/14/chartex" xmlns:mc="http://schemas.openxmlformats.org/markup-compatibility/2006" xmlns:aink="http://schemas.microsoft.com/office/drawing/2016/ink" xmlns:am3d="http://schemas.microsoft.com/office/drawing/2017/model3d" xmlns:o="urn:schemas-microsoft-com:office:office" xmlns:oel="http://schemas.microsoft.com/office/2019/extlst" xmlns:r="http://schemas.openxmlformats.org/officeDocument/2006/relationships" xmlns:m="http://schemas.openxmlformats.org/officeDocument/2006/math" xmlns:v="urn:schemas-microsoft-com:vml" xmlns:wp14="http://schemas.microsoft.com/office/word/2010/wordprocessingDrawing" xmlns:wp="http://schemas.openxmlformats.org/drawingml/2006/wordprocessingDrawing" xmlns:w10="urn:schemas-microsoft-com:office:word" xmlns:w="http://schemas.openxmlformats.org/wordprocessingml/2006/main" xmlns:w14="http://schemas.microsoft.com/office/word/2010/wordml" xmlns:w15="http://schemas.microsoft.com/office/word/2012/wordml" xmlns:w16cex="http://schemas.microsoft.com/office/word/2018/wordml/cex" xmlns:w16cid="http://schemas.microsoft.com/office/word/2016/wordml/cid" xmlns:w16="http://schemas.microsoft.com/office/word/2018/wordml" xmlns:w16du="http://schemas.microsoft.com/office/word/2023/wordml/word16du" xmlns:w16sdtdh="http://schemas.microsoft.com/office/word/2020/wordml/sdtdatahash" xmlns:w16se="http://schemas.microsoft.com/office/word/2015/wordml/symex" xmlns:wpg="http://schemas.microsoft.com/office/word/2010/wordprocessingGroup" xmlns:wpi="http://schemas.microsoft.com/office/word/2010/wordprocessingInk" xmlns:wne="http://schemas.microsoft.com/office/word/2006/wordml" xmlns:wps="http://schemas.microsoft.com/office/word/2010/wordprocessingShape" mc:Ignorable="w14 w15 w16se w16cid w16 w16cex w16sdtdh w16du wp14">
+<w:endnotes xmlns:wpc="http://schemas.microsoft.com/office/word/2010/wordprocessingCanvas" xmlns:cx="http://schemas.microsoft.com/office/drawing/2014/chartex" xmlns:cx1="http://schemas.microsoft.com/office/drawing/2015/9/8/chartex" xmlns:cx2="http://schemas.microsoft.com/office/drawing/2015/10/21/chartex" xmlns:cx3="http://schemas.microsoft.com/office/drawing/2016/5/9/chartex" xmlns:cx4="http://schemas.microsoft.com/office/drawing/2016/5/10/chartex" xmlns:cx5="http://schemas.microsoft.com/office/drawing/2016/5/11/chartex" xmlns:cx6="http://schemas.microsoft.com/office/drawing/2016/5/12/chartex" xmlns:cx7="http://schemas.microsoft.com/office/drawing/2016/5/13/chartex" xmlns:cx8="http://schemas.microsoft.com/office/drawing/2016/5/14/chartex" xmlns:mc="http://schemas.openxmlformats.org/markup-compatibility/2006" xmlns:aink="http://schemas.microsoft.com/office/drawing/2016/ink" xmlns:am3d="http://schemas.microsoft.com/office/drawing/2017/model3d" xmlns:o="urn:schemas-microsoft-com:office:office" xmlns:oel="http://schemas.microsoft.com/office/2019/extlst" xmlns:r="http://schemas.openxmlformats.org/officeDocument/2006/relationships" xmlns:m="http://schemas.openxmlformats.org/officeDocument/2006/math" xmlns:v="urn:schemas-microsoft-com:vml" xmlns:wp14="http://schemas.microsoft.com/office/word/2010/wordprocessingDrawing" xmlns:wp="http://schemas.openxmlformats.org/drawingml/2006/wordprocessingDrawing" xmlns:w10="urn:schemas-microsoft-com:office:word" xmlns:w="http://schemas.openxmlformats.org/wordprocessingml/2006/main" xmlns:w14="http://schemas.microsoft.com/office/word/2010/wordml" xmlns:w15="http://schemas.microsoft.com/office/word/2012/wordml" xmlns:w16cex="http://schemas.microsoft.com/office/word/2018/wordml/cex" xmlns:w16cid="http://schemas.microsoft.com/office/word/2016/wordml/cid" xmlns:w16="http://schemas.microsoft.com/office/word/2018/wordml" xmlns:w16du="http://schemas.microsoft.com/office/word/2023/wordml/word16du" xmlns:w16sdtdh="http://schemas.microsoft.com/office/word/2020/wordml/sdtdatahash" xmlns:w16sdtfl="http://schemas.microsoft.com/office/word/2024/wordml/sdtformatlock" xmlns:w16se="http://schemas.microsoft.com/office/word/2015/wordml/symex" xmlns:wpg="http://schemas.microsoft.com/office/word/2010/wordprocessingGroup" xmlns:wpi="http://schemas.microsoft.com/office/word/2010/wordprocessingInk" xmlns:wne="http://schemas.microsoft.com/office/word/2006/wordml" xmlns:wps="http://schemas.microsoft.com/office/word/2010/wordprocessingShape" mc:Ignorable="w14 w15 w16se w16cid w16 w16cex w16sdtdh w16sdtfl w16du wp14">
   <w:endnote w:type="separator" w:id="-1">
     <w:p>
       <w:pPr>
@@ -5445,7 +6017,7 @@
 </file>
 
 <file path=word/footer1.xml><?xml version="1.0" encoding="utf-8"?>
-<w:ftr xmlns:wpc="http://schemas.microsoft.com/office/word/2010/wordprocessingCanvas" xmlns:cx="http://schemas.microsoft.com/office/drawing/2014/chartex" xmlns:cx1="http://schemas.microsoft.com/office/drawing/2015/9/8/chartex" xmlns:cx2="http://schemas.microsoft.com/office/drawing/2015/10/21/chartex" xmlns:cx3="http://schemas.microsoft.com/office/drawing/2016/5/9/chartex" xmlns:cx4="http://schemas.microsoft.com/office/drawing/2016/5/10/chartex" xmlns:cx5="http://schemas.microsoft.com/office/drawing/2016/5/11/chartex" xmlns:cx6="http://schemas.microsoft.com/office/drawing/2016/5/12/chartex" xmlns:cx7="http://schemas.microsoft.com/office/drawing/2016/5/13/chartex" xmlns:cx8="http://schemas.microsoft.com/office/drawing/2016/5/14/chartex" xmlns:mc="http://schemas.openxmlformats.org/markup-compatibility/2006" xmlns:aink="http://schemas.microsoft.com/office/drawing/2016/ink" xmlns:am3d="http://schemas.microsoft.com/office/drawing/2017/model3d" xmlns:o="urn:schemas-microsoft-com:office:office" xmlns:oel="http://schemas.microsoft.com/office/2019/extlst" xmlns:r="http://schemas.openxmlformats.org/officeDocument/2006/relationships" xmlns:m="http://schemas.openxmlformats.org/officeDocument/2006/math" xmlns:v="urn:schemas-microsoft-com:vml" xmlns:wp14="http://schemas.microsoft.com/office/word/2010/wordprocessingDrawing" xmlns:wp="http://schemas.openxmlformats.org/drawingml/2006/wordprocessingDrawing" xmlns:w10="urn:schemas-microsoft-com:office:word" xmlns:w="http://schemas.openxmlformats.org/wordprocessingml/2006/main" xmlns:w14="http://schemas.microsoft.com/office/word/2010/wordml" xmlns:w15="http://schemas.microsoft.com/office/word/2012/wordml" xmlns:w16cex="http://schemas.microsoft.com/office/word/2018/wordml/cex" xmlns:w16cid="http://schemas.microsoft.com/office/word/2016/wordml/cid" xmlns:w16="http://schemas.microsoft.com/office/word/2018/wordml" xmlns:w16du="http://schemas.microsoft.com/office/word/2023/wordml/word16du" xmlns:w16sdtdh="http://schemas.microsoft.com/office/word/2020/wordml/sdtdatahash" xmlns:w16se="http://schemas.microsoft.com/office/word/2015/wordml/symex" xmlns:wpg="http://schemas.microsoft.com/office/word/2010/wordprocessingGroup" xmlns:wpi="http://schemas.microsoft.com/office/word/2010/wordprocessingInk" xmlns:wne="http://schemas.microsoft.com/office/word/2006/wordml" xmlns:wps="http://schemas.microsoft.com/office/word/2010/wordprocessingShape" mc:Ignorable="w14 w15 w16se w16cid w16 w16cex w16sdtdh w16du wp14">
+<w:ftr xmlns:wpc="http://schemas.microsoft.com/office/word/2010/wordprocessingCanvas" xmlns:cx="http://schemas.microsoft.com/office/drawing/2014/chartex" xmlns:cx1="http://schemas.microsoft.com/office/drawing/2015/9/8/chartex" xmlns:cx2="http://schemas.microsoft.com/office/drawing/2015/10/21/chartex" xmlns:cx3="http://schemas.microsoft.com/office/drawing/2016/5/9/chartex" xmlns:cx4="http://schemas.microsoft.com/office/drawing/2016/5/10/chartex" xmlns:cx5="http://schemas.microsoft.com/office/drawing/2016/5/11/chartex" xmlns:cx6="http://schemas.microsoft.com/office/drawing/2016/5/12/chartex" xmlns:cx7="http://schemas.microsoft.com/office/drawing/2016/5/13/chartex" xmlns:cx8="http://schemas.microsoft.com/office/drawing/2016/5/14/chartex" xmlns:mc="http://schemas.openxmlformats.org/markup-compatibility/2006" xmlns:aink="http://schemas.microsoft.com/office/drawing/2016/ink" xmlns:am3d="http://schemas.microsoft.com/office/drawing/2017/model3d" xmlns:o="urn:schemas-microsoft-com:office:office" xmlns:oel="http://schemas.microsoft.com/office/2019/extlst" xmlns:r="http://schemas.openxmlformats.org/officeDocument/2006/relationships" xmlns:m="http://schemas.openxmlformats.org/officeDocument/2006/math" xmlns:v="urn:schemas-microsoft-com:vml" xmlns:wp14="http://schemas.microsoft.com/office/word/2010/wordprocessingDrawing" xmlns:wp="http://schemas.openxmlformats.org/drawingml/2006/wordprocessingDrawing" xmlns:w10="urn:schemas-microsoft-com:office:word" xmlns:w="http://schemas.openxmlformats.org/wordprocessingml/2006/main" xmlns:w14="http://schemas.microsoft.com/office/word/2010/wordml" xmlns:w15="http://schemas.microsoft.com/office/word/2012/wordml" xmlns:w16cex="http://schemas.microsoft.com/office/word/2018/wordml/cex" xmlns:w16cid="http://schemas.microsoft.com/office/word/2016/wordml/cid" xmlns:w16="http://schemas.microsoft.com/office/word/2018/wordml" xmlns:w16du="http://schemas.microsoft.com/office/word/2023/wordml/word16du" xmlns:w16sdtdh="http://schemas.microsoft.com/office/word/2020/wordml/sdtdatahash" xmlns:w16sdtfl="http://schemas.microsoft.com/office/word/2024/wordml/sdtformatlock" xmlns:w16se="http://schemas.microsoft.com/office/word/2015/wordml/symex" xmlns:wpg="http://schemas.microsoft.com/office/word/2010/wordprocessingGroup" xmlns:wpi="http://schemas.microsoft.com/office/word/2010/wordprocessingInk" xmlns:wne="http://schemas.microsoft.com/office/word/2006/wordml" xmlns:wps="http://schemas.microsoft.com/office/word/2010/wordprocessingShape" mc:Ignorable="w14 w15 w16se w16cid w16 w16cex w16sdtdh w16sdtfl w16du wp14">
   <w:p>
     <w:pPr>
       <w:widowControl w:val="0"/>
@@ -5581,7 +6153,7 @@
 </file>
 
 <file path=word/footnotes.xml><?xml version="1.0" encoding="utf-8"?>
-<w:footnotes xmlns:wpc="http://schemas.microsoft.com/office/word/2010/wordprocessingCanvas" xmlns:cx="http://schemas.microsoft.com/office/drawing/2014/chartex" xmlns:cx1="http://schemas.microsoft.com/office/drawing/2015/9/8/chartex" xmlns:cx2="http://schemas.microsoft.com/office/drawing/2015/10/21/chartex" xmlns:cx3="http://schemas.microsoft.com/office/drawing/2016/5/9/chartex" xmlns:cx4="http://schemas.microsoft.com/office/drawing/2016/5/10/chartex" xmlns:cx5="http://schemas.microsoft.com/office/drawing/2016/5/11/chartex" xmlns:cx6="http://schemas.microsoft.com/office/drawing/2016/5/12/chartex" xmlns:cx7="http://schemas.microsoft.com/office/drawing/2016/5/13/chartex" xmlns:cx8="http://schemas.microsoft.com/office/drawing/2016/5/14/chartex" xmlns:mc="http://schemas.openxmlformats.org/markup-compatibility/2006" xmlns:aink="http://schemas.microsoft.com/office/drawing/2016/ink" xmlns:am3d="http://schemas.microsoft.com/office/drawing/2017/model3d" xmlns:o="urn:schemas-microsoft-com:office:office" xmlns:oel="http://schemas.microsoft.com/office/2019/extlst" xmlns:r="http://schemas.openxmlformats.org/officeDocument/2006/relationships" xmlns:m="http://schemas.openxmlformats.org/officeDocument/2006/math" xmlns:v="urn:schemas-microsoft-com:vml" xmlns:wp14="http://schemas.microsoft.com/office/word/2010/wordprocessingDrawing" xmlns:wp="http://schemas.openxmlformats.org/drawingml/2006/wordprocessingDrawing" xmlns:w10="urn:schemas-microsoft-com:office:word" xmlns:w="http://schemas.openxmlformats.org/wordprocessingml/2006/main" xmlns:w14="http://schemas.microsoft.com/office/word/2010/wordml" xmlns:w15="http://schemas.microsoft.com/office/word/2012/wordml" xmlns:w16cex="http://schemas.microsoft.com/office/word/2018/wordml/cex" xmlns:w16cid="http://schemas.microsoft.com/office/word/2016/wordml/cid" xmlns:w16="http://schemas.microsoft.com/office/word/2018/wordml" xmlns:w16du="http://schemas.microsoft.com/office/word/2023/wordml/word16du" xmlns:w16sdtdh="http://schemas.microsoft.com/office/word/2020/wordml/sdtdatahash" xmlns:w16se="http://schemas.microsoft.com/office/word/2015/wordml/symex" xmlns:wpg="http://schemas.microsoft.com/office/word/2010/wordprocessingGroup" xmlns:wpi="http://schemas.microsoft.com/office/word/2010/wordprocessingInk" xmlns:wne="http://schemas.microsoft.com/office/word/2006/wordml" xmlns:wps="http://schemas.microsoft.com/office/word/2010/wordprocessingShape" mc:Ignorable="w14 w15 w16se w16cid w16 w16cex w16sdtdh w16du wp14">
+<w:footnotes xmlns:wpc="http://schemas.microsoft.com/office/word/2010/wordprocessingCanvas" xmlns:cx="http://schemas.microsoft.com/office/drawing/2014/chartex" xmlns:cx1="http://schemas.microsoft.com/office/drawing/2015/9/8/chartex" xmlns:cx2="http://schemas.microsoft.com/office/drawing/2015/10/21/chartex" xmlns:cx3="http://schemas.microsoft.com/office/drawing/2016/5/9/chartex" xmlns:cx4="http://schemas.microsoft.com/office/drawing/2016/5/10/chartex" xmlns:cx5="http://schemas.microsoft.com/office/drawing/2016/5/11/chartex" xmlns:cx6="http://schemas.microsoft.com/office/drawing/2016/5/12/chartex" xmlns:cx7="http://schemas.microsoft.com/office/drawing/2016/5/13/chartex" xmlns:cx8="http://schemas.microsoft.com/office/drawing/2016/5/14/chartex" xmlns:mc="http://schemas.openxmlformats.org/markup-compatibility/2006" xmlns:aink="http://schemas.microsoft.com/office/drawing/2016/ink" xmlns:am3d="http://schemas.microsoft.com/office/drawing/2017/model3d" xmlns:o="urn:schemas-microsoft-com:office:office" xmlns:oel="http://schemas.microsoft.com/office/2019/extlst" xmlns:r="http://schemas.openxmlformats.org/officeDocument/2006/relationships" xmlns:m="http://schemas.openxmlformats.org/officeDocument/2006/math" xmlns:v="urn:schemas-microsoft-com:vml" xmlns:wp14="http://schemas.microsoft.com/office/word/2010/wordprocessingDrawing" xmlns:wp="http://schemas.openxmlformats.org/drawingml/2006/wordprocessingDrawing" xmlns:w10="urn:schemas-microsoft-com:office:word" xmlns:w="http://schemas.openxmlformats.org/wordprocessingml/2006/main" xmlns:w14="http://schemas.microsoft.com/office/word/2010/wordml" xmlns:w15="http://schemas.microsoft.com/office/word/2012/wordml" xmlns:w16cex="http://schemas.microsoft.com/office/word/2018/wordml/cex" xmlns:w16cid="http://schemas.microsoft.com/office/word/2016/wordml/cid" xmlns:w16="http://schemas.microsoft.com/office/word/2018/wordml" xmlns:w16du="http://schemas.microsoft.com/office/word/2023/wordml/word16du" xmlns:w16sdtdh="http://schemas.microsoft.com/office/word/2020/wordml/sdtdatahash" xmlns:w16sdtfl="http://schemas.microsoft.com/office/word/2024/wordml/sdtformatlock" xmlns:w16se="http://schemas.microsoft.com/office/word/2015/wordml/symex" xmlns:wpg="http://schemas.microsoft.com/office/word/2010/wordprocessingGroup" xmlns:wpi="http://schemas.microsoft.com/office/word/2010/wordprocessingInk" xmlns:wne="http://schemas.microsoft.com/office/word/2006/wordml" xmlns:wps="http://schemas.microsoft.com/office/word/2010/wordprocessingShape" mc:Ignorable="w14 w15 w16se w16cid w16 w16cex w16sdtdh w16sdtfl w16du wp14">
   <w:footnote w:type="separator" w:id="-1">
     <w:p>
       <w:pPr>
@@ -5606,7 +6178,7 @@
 </file>
 
 <file path=word/header1.xml><?xml version="1.0" encoding="utf-8"?>
-<w:hdr xmlns:wpc="http://schemas.microsoft.com/office/word/2010/wordprocessingCanvas" xmlns:cx="http://schemas.microsoft.com/office/drawing/2014/chartex" xmlns:cx1="http://schemas.microsoft.com/office/drawing/2015/9/8/chartex" xmlns:cx2="http://schemas.microsoft.com/office/drawing/2015/10/21/chartex" xmlns:cx3="http://schemas.microsoft.com/office/drawing/2016/5/9/chartex" xmlns:cx4="http://schemas.microsoft.com/office/drawing/2016/5/10/chartex" xmlns:cx5="http://schemas.microsoft.com/office/drawing/2016/5/11/chartex" xmlns:cx6="http://schemas.microsoft.com/office/drawing/2016/5/12/chartex" xmlns:cx7="http://schemas.microsoft.com/office/drawing/2016/5/13/chartex" xmlns:cx8="http://schemas.microsoft.com/office/drawing/2016/5/14/chartex" xmlns:mc="http://schemas.openxmlformats.org/markup-compatibility/2006" xmlns:aink="http://schemas.microsoft.com/office/drawing/2016/ink" xmlns:am3d="http://schemas.microsoft.com/office/drawing/2017/model3d" xmlns:o="urn:schemas-microsoft-com:office:office" xmlns:oel="http://schemas.microsoft.com/office/2019/extlst" xmlns:r="http://schemas.openxmlformats.org/officeDocument/2006/relationships" xmlns:m="http://schemas.openxmlformats.org/officeDocument/2006/math" xmlns:v="urn:schemas-microsoft-com:vml" xmlns:wp14="http://schemas.microsoft.com/office/word/2010/wordprocessingDrawing" xmlns:wp="http://schemas.openxmlformats.org/drawingml/2006/wordprocessingDrawing" xmlns:w10="urn:schemas-microsoft-com:office:word" xmlns:w="http://schemas.openxmlformats.org/wordprocessingml/2006/main" xmlns:w14="http://schemas.microsoft.com/office/word/2010/wordml" xmlns:w15="http://schemas.microsoft.com/office/word/2012/wordml" xmlns:w16cex="http://schemas.microsoft.com/office/word/2018/wordml/cex" xmlns:w16cid="http://schemas.microsoft.com/office/word/2016/wordml/cid" xmlns:w16="http://schemas.microsoft.com/office/word/2018/wordml" xmlns:w16du="http://schemas.microsoft.com/office/word/2023/wordml/word16du" xmlns:w16sdtdh="http://schemas.microsoft.com/office/word/2020/wordml/sdtdatahash" xmlns:w16se="http://schemas.microsoft.com/office/word/2015/wordml/symex" xmlns:wpg="http://schemas.microsoft.com/office/word/2010/wordprocessingGroup" xmlns:wpi="http://schemas.microsoft.com/office/word/2010/wordprocessingInk" xmlns:wne="http://schemas.microsoft.com/office/word/2006/wordml" xmlns:wps="http://schemas.microsoft.com/office/word/2010/wordprocessingShape" mc:Ignorable="w14 w15 w16se w16cid w16 w16cex w16sdtdh w16du wp14">
+<w:hdr xmlns:wpc="http://schemas.microsoft.com/office/word/2010/wordprocessingCanvas" xmlns:cx="http://schemas.microsoft.com/office/drawing/2014/chartex" xmlns:cx1="http://schemas.microsoft.com/office/drawing/2015/9/8/chartex" xmlns:cx2="http://schemas.microsoft.com/office/drawing/2015/10/21/chartex" xmlns:cx3="http://schemas.microsoft.com/office/drawing/2016/5/9/chartex" xmlns:cx4="http://schemas.microsoft.com/office/drawing/2016/5/10/chartex" xmlns:cx5="http://schemas.microsoft.com/office/drawing/2016/5/11/chartex" xmlns:cx6="http://schemas.microsoft.com/office/drawing/2016/5/12/chartex" xmlns:cx7="http://schemas.microsoft.com/office/drawing/2016/5/13/chartex" xmlns:cx8="http://schemas.microsoft.com/office/drawing/2016/5/14/chartex" xmlns:mc="http://schemas.openxmlformats.org/markup-compatibility/2006" xmlns:aink="http://schemas.microsoft.com/office/drawing/2016/ink" xmlns:am3d="http://schemas.microsoft.com/office/drawing/2017/model3d" xmlns:o="urn:schemas-microsoft-com:office:office" xmlns:oel="http://schemas.microsoft.com/office/2019/extlst" xmlns:r="http://schemas.openxmlformats.org/officeDocument/2006/relationships" xmlns:m="http://schemas.openxmlformats.org/officeDocument/2006/math" xmlns:v="urn:schemas-microsoft-com:vml" xmlns:wp14="http://schemas.microsoft.com/office/word/2010/wordprocessingDrawing" xmlns:wp="http://schemas.openxmlformats.org/drawingml/2006/wordprocessingDrawing" xmlns:w10="urn:schemas-microsoft-com:office:word" xmlns:w="http://schemas.openxmlformats.org/wordprocessingml/2006/main" xmlns:w14="http://schemas.microsoft.com/office/word/2010/wordml" xmlns:w15="http://schemas.microsoft.com/office/word/2012/wordml" xmlns:w16cex="http://schemas.microsoft.com/office/word/2018/wordml/cex" xmlns:w16cid="http://schemas.microsoft.com/office/word/2016/wordml/cid" xmlns:w16="http://schemas.microsoft.com/office/word/2018/wordml" xmlns:w16du="http://schemas.microsoft.com/office/word/2023/wordml/word16du" xmlns:w16sdtdh="http://schemas.microsoft.com/office/word/2020/wordml/sdtdatahash" xmlns:w16sdtfl="http://schemas.microsoft.com/office/word/2024/wordml/sdtformatlock" xmlns:w16se="http://schemas.microsoft.com/office/word/2015/wordml/symex" xmlns:wpg="http://schemas.microsoft.com/office/word/2010/wordprocessingGroup" xmlns:wpi="http://schemas.microsoft.com/office/word/2010/wordprocessingInk" xmlns:wne="http://schemas.microsoft.com/office/word/2006/wordml" xmlns:wps="http://schemas.microsoft.com/office/word/2010/wordprocessingShape" mc:Ignorable="w14 w15 w16se w16cid w16 w16cex w16sdtdh w16sdtfl w16du wp14">
   <w:p>
     <w:pPr>
       <w:pStyle w:val="Header"/>
@@ -5668,7 +6240,7 @@
 </file>
 
 <file path=word/numbering.xml><?xml version="1.0" encoding="utf-8"?>
-<w:numbering xmlns:wpc="http://schemas.microsoft.com/office/word/2010/wordprocessingCanvas" xmlns:cx="http://schemas.microsoft.com/office/drawing/2014/chartex" xmlns:cx1="http://schemas.microsoft.com/office/drawing/2015/9/8/chartex" xmlns:cx2="http://schemas.microsoft.com/office/drawing/2015/10/21/chartex" xmlns:cx3="http://schemas.microsoft.com/office/drawing/2016/5/9/chartex" xmlns:cx4="http://schemas.microsoft.com/office/drawing/2016/5/10/chartex" xmlns:cx5="http://schemas.microsoft.com/office/drawing/2016/5/11/chartex" xmlns:cx6="http://schemas.microsoft.com/office/drawing/2016/5/12/chartex" xmlns:cx7="http://schemas.microsoft.com/office/drawing/2016/5/13/chartex" xmlns:cx8="http://schemas.microsoft.com/office/drawing/2016/5/14/chartex" xmlns:mc="http://schemas.openxmlformats.org/markup-compatibility/2006" xmlns:aink="http://schemas.microsoft.com/office/drawing/2016/ink" xmlns:am3d="http://schemas.microsoft.com/office/drawing/2017/model3d" xmlns:o="urn:schemas-microsoft-com:office:office" xmlns:oel="http://schemas.microsoft.com/office/2019/extlst" xmlns:r="http://schemas.openxmlformats.org/officeDocument/2006/relationships" xmlns:m="http://schemas.openxmlformats.org/officeDocument/2006/math" xmlns:v="urn:schemas-microsoft-com:vml" xmlns:wp14="http://schemas.microsoft.com/office/word/2010/wordprocessingDrawing" xmlns:wp="http://schemas.openxmlformats.org/drawingml/2006/wordprocessingDrawing" xmlns:w10="urn:schemas-microsoft-com:office:word" xmlns:w="http://schemas.openxmlformats.org/wordprocessingml/2006/main" xmlns:w14="http://schemas.microsoft.com/office/word/2010/wordml" xmlns:w15="http://schemas.microsoft.com/office/word/2012/wordml" xmlns:w16cex="http://schemas.microsoft.com/office/word/2018/wordml/cex" xmlns:w16cid="http://schemas.microsoft.com/office/word/2016/wordml/cid" xmlns:w16="http://schemas.microsoft.com/office/word/2018/wordml" xmlns:w16du="http://schemas.microsoft.com/office/word/2023/wordml/word16du" xmlns:w16sdtdh="http://schemas.microsoft.com/office/word/2020/wordml/sdtdatahash" xmlns:w16se="http://schemas.microsoft.com/office/word/2015/wordml/symex" xmlns:wpg="http://schemas.microsoft.com/office/word/2010/wordprocessingGroup" xmlns:wpi="http://schemas.microsoft.com/office/word/2010/wordprocessingInk" xmlns:wne="http://schemas.microsoft.com/office/word/2006/wordml" xmlns:wps="http://schemas.microsoft.com/office/word/2010/wordprocessingShape" mc:Ignorable="w14 w15 w16se w16cid w16 w16cex w16sdtdh w16du wp14">
+<w:numbering xmlns:wpc="http://schemas.microsoft.com/office/word/2010/wordprocessingCanvas" xmlns:cx="http://schemas.microsoft.com/office/drawing/2014/chartex" xmlns:cx1="http://schemas.microsoft.com/office/drawing/2015/9/8/chartex" xmlns:cx2="http://schemas.microsoft.com/office/drawing/2015/10/21/chartex" xmlns:cx3="http://schemas.microsoft.com/office/drawing/2016/5/9/chartex" xmlns:cx4="http://schemas.microsoft.com/office/drawing/2016/5/10/chartex" xmlns:cx5="http://schemas.microsoft.com/office/drawing/2016/5/11/chartex" xmlns:cx6="http://schemas.microsoft.com/office/drawing/2016/5/12/chartex" xmlns:cx7="http://schemas.microsoft.com/office/drawing/2016/5/13/chartex" xmlns:cx8="http://schemas.microsoft.com/office/drawing/2016/5/14/chartex" xmlns:mc="http://schemas.openxmlformats.org/markup-compatibility/2006" xmlns:aink="http://schemas.microsoft.com/office/drawing/2016/ink" xmlns:am3d="http://schemas.microsoft.com/office/drawing/2017/model3d" xmlns:o="urn:schemas-microsoft-com:office:office" xmlns:oel="http://schemas.microsoft.com/office/2019/extlst" xmlns:r="http://schemas.openxmlformats.org/officeDocument/2006/relationships" xmlns:m="http://schemas.openxmlformats.org/officeDocument/2006/math" xmlns:v="urn:schemas-microsoft-com:vml" xmlns:wp14="http://schemas.microsoft.com/office/word/2010/wordprocessingDrawing" xmlns:wp="http://schemas.openxmlformats.org/drawingml/2006/wordprocessingDrawing" xmlns:w10="urn:schemas-microsoft-com:office:word" xmlns:w="http://schemas.openxmlformats.org/wordprocessingml/2006/main" xmlns:w14="http://schemas.microsoft.com/office/word/2010/wordml" xmlns:w15="http://schemas.microsoft.com/office/word/2012/wordml" xmlns:w16cex="http://schemas.microsoft.com/office/word/2018/wordml/cex" xmlns:w16cid="http://schemas.microsoft.com/office/word/2016/wordml/cid" xmlns:w16="http://schemas.microsoft.com/office/word/2018/wordml" xmlns:w16du="http://schemas.microsoft.com/office/word/2023/wordml/word16du" xmlns:w16sdtdh="http://schemas.microsoft.com/office/word/2020/wordml/sdtdatahash" xmlns:w16sdtfl="http://schemas.microsoft.com/office/word/2024/wordml/sdtformatlock" xmlns:w16se="http://schemas.microsoft.com/office/word/2015/wordml/symex" xmlns:wpg="http://schemas.microsoft.com/office/word/2010/wordprocessingGroup" xmlns:wpi="http://schemas.microsoft.com/office/word/2010/wordprocessingInk" xmlns:wne="http://schemas.microsoft.com/office/word/2006/wordml" xmlns:wps="http://schemas.microsoft.com/office/word/2010/wordprocessingShape" mc:Ignorable="w14 w15 w16se w16cid w16 w16cex w16sdtdh w16sdtfl w16du wp14">
   <w:abstractNum w:abstractNumId="0" w15:restartNumberingAfterBreak="0">
     <w:nsid w:val="014A1F71"/>
     <w:multiLevelType w:val="hybridMultilevel"/>
@@ -7202,7 +7774,7 @@
 </file>
 
 <file path=word/styles.xml><?xml version="1.0" encoding="utf-8"?>
-<w:styles xmlns:mc="http://schemas.openxmlformats.org/markup-compatibility/2006" xmlns:r="http://schemas.openxmlformats.org/officeDocument/2006/relationships" xmlns:w="http://schemas.openxmlformats.org/wordprocessingml/2006/main" xmlns:w14="http://schemas.microsoft.com/office/word/2010/wordml" xmlns:w15="http://schemas.microsoft.com/office/word/2012/wordml" xmlns:w16cex="http://schemas.microsoft.com/office/word/2018/wordml/cex" xmlns:w16cid="http://schemas.microsoft.com/office/word/2016/wordml/cid" xmlns:w16="http://schemas.microsoft.com/office/word/2018/wordml" xmlns:w16du="http://schemas.microsoft.com/office/word/2023/wordml/word16du" xmlns:w16sdtdh="http://schemas.microsoft.com/office/word/2020/wordml/sdtdatahash" xmlns:w16se="http://schemas.microsoft.com/office/word/2015/wordml/symex" mc:Ignorable="w14 w15 w16se w16cid w16 w16cex w16sdtdh w16du">
+<w:styles xmlns:mc="http://schemas.openxmlformats.org/markup-compatibility/2006" xmlns:r="http://schemas.openxmlformats.org/officeDocument/2006/relationships" xmlns:w="http://schemas.openxmlformats.org/wordprocessingml/2006/main" xmlns:w14="http://schemas.microsoft.com/office/word/2010/wordml" xmlns:w15="http://schemas.microsoft.com/office/word/2012/wordml" xmlns:w16cex="http://schemas.microsoft.com/office/word/2018/wordml/cex" xmlns:w16cid="http://schemas.microsoft.com/office/word/2016/wordml/cid" xmlns:w16="http://schemas.microsoft.com/office/word/2018/wordml" xmlns:w16du="http://schemas.microsoft.com/office/word/2023/wordml/word16du" xmlns:w16sdtdh="http://schemas.microsoft.com/office/word/2020/wordml/sdtdatahash" xmlns:w16sdtfl="http://schemas.microsoft.com/office/word/2024/wordml/sdtformatlock" xmlns:w16se="http://schemas.microsoft.com/office/word/2015/wordml/symex" mc:Ignorable="w14 w15 w16se w16cid w16 w16cex w16sdtdh w16sdtfl w16du">
   <w:docDefaults>
     <w:rPrDefault>
       <w:rPr>

</xml_diff>